<commit_message>
Style pass: remove AI-tell em-dashes from BMC Bioinformatics submission pack (v1.24.0, no content change)
- Strip all prose em-dashes from manuscript.md, BMC_structured_abstract.md, Cover_Letter_BMC.md and the build script; recast as commas/semicolons/periods.
- Fixed 6 comma splices where an em-dash had joined two independent clauses by converting the comma to a semicolon.
- Table-cell no-value em-dash changed to n/a; parenthetical rounding-artifact em-dash rephrased.
- Rebuilt all three docx; final sweep: 0 em-dashes in any docx or source markdown.
- verify_submission_bmcbio.py still exits 0 (refs=40, figs=10, key numbers intact): pure style pass.
</commit_message>
<xml_diff>
--- a/07_submission_bmcbio_v1.24.0/Cover_Letter.docx
+++ b/07_submission_bmcbio_v1.24.0/Cover_Letter.docx
@@ -84,7 +84,7 @@
           <w:b w:val="0"/>
           <w:i w:val="0"/>
         </w:rPr>
-        <w:t>This is a computational-biology / methods contribution: a reproducible, fully auditable analytical pipeline; an honest external validation of a sepsis prognostic signature that is independent in cohort and platform but not in label; and an explicit experimental blueprint for in-vitro validation. BMC Bioinformatics explicitly considers articles describing computational algorithms, software, models and tools for the modelling and analysis of all kinds of biological data, and does not make editorial decisions based on the perceived interest or impact of a study — a methodological contribution of this kind is squarely within its scope.</w:t>
+        <w:t>This is a computational-biology / methods contribution: a reproducible, fully auditable analytical pipeline; an honest external validation of a sepsis prognostic signature that is independent in cohort and platform but not in label; and an explicit experimental blueprint for in-vitro validation. BMC Bioinformatics explicitly considers articles describing computational algorithms, software, models and tools for the modelling and analysis of all kinds of biological data, and does not make editorial decisions based on the perceived interest or impact of a study, a methodological contribution of this kind is squarely within its scope.</w:t>
       </w:r>
     </w:p>
     <w:p>
@@ -112,7 +112,7 @@
           <w:b w:val="0"/>
           <w:i w:val="0"/>
         </w:rPr>
-        <w:t>The five confirmed immune hubs confirm within-cohort the established MARS Mars1 antigen-presentation program (a within-cohort confirmation, not an independent replication — the Mars1 labels originate from the MARS consortium's own clustering of this same cohort), and we annotate seven immune-modulating agents as hypothesis-generating repositioning candidates; their curated immune-response concordance lies at or below the study's own 0.84 background and the LINCS L1000 positive-control gate was non-discriminating (the immunosuppressant prednisone ranked in the 3.2nd percentile), so none is prioritised by significance.</w:t>
+        <w:t>The five confirmed immune hubs confirm within-cohort the established MARS Mars1 antigen-presentation program (a within-cohort confirmation, not an independent replication; the Mars1 labels originate from the MARS consortium's own clustering of this same cohort), and we annotate seven immune-modulating agents as hypothesis-generating repositioning candidates; their curated immune-response concordance lies at or below the study's own 0.84 background and the LINCS L1000 positive-control gate was non-discriminating (the immunosuppressant prednisone ranked in the 3.2nd percentile), so none is prioritised by significance.</w:t>
       </w:r>
     </w:p>
     <w:p>

</xml_diff>